<commit_message>
Added notification item, updated booking item
</commit_message>
<xml_diff>
--- a/Documentation.docx
+++ b/Documentation.docx
@@ -20,7 +20,26 @@
         <w:rPr>
           <w:lang w:val="en-GB"/>
         </w:rPr>
-        <w:t xml:space="preserve"> -&gt; </w:t>
+        <w:t xml:space="preserve"> </w:t>
+      </w:r>
+    </w:p>
+    <w:p>
+      <w:pPr>
+        <w:rPr>
+          <w:lang w:val="en-GB"/>
+        </w:rPr>
+      </w:pPr>
+      <w:r>
+        <w:rPr>
+          <w:lang w:val="en-GB"/>
+        </w:rPr>
+        <w:t>https://dribbble.com/shots/15449198-Event-Booking-App-UI-Light-version</w:t>
+      </w:r>
+      <w:r>
+        <w:rPr>
+          <w:lang w:val="en-GB"/>
+        </w:rPr>
+        <w:t xml:space="preserve"> </w:t>
       </w:r>
       <w:hyperlink r:id="rId5" w:history="1">
         <w:r>
@@ -31,6 +50,180 @@
           <w:t>https://dribbble.com/shots/23505028-Event-Booking-App</w:t>
         </w:r>
       </w:hyperlink>
+    </w:p>
+    <w:p>
+      <w:pPr>
+        <w:rPr>
+          <w:lang w:val="en-GB"/>
+        </w:rPr>
+      </w:pPr>
+      <w:hyperlink r:id="rId6" w:history="1">
+        <w:r>
+          <w:rPr>
+            <w:rStyle w:val="Hyperlink"/>
+            <w:lang w:val="en-GB"/>
+          </w:rPr>
+          <w:t>https://dribbble.com/shots/25700245-Eventure-A-Smart-Mobile-App-for-Effortless-Event-Booking</w:t>
+        </w:r>
+      </w:hyperlink>
+    </w:p>
+    <w:p>
+      <w:pPr>
+        <w:rPr>
+          <w:lang w:val="en-GB"/>
+        </w:rPr>
+      </w:pPr>
+    </w:p>
+    <w:p>
+      <w:pPr>
+        <w:rPr>
+          <w:lang w:val="en-GB"/>
+        </w:rPr>
+      </w:pPr>
+      <w:r>
+        <w:rPr>
+          <w:lang w:val="en-GB"/>
+        </w:rPr>
+        <w:t xml:space="preserve">echo "# </w:t>
+      </w:r>
+      <w:proofErr w:type="spellStart"/>
+      <w:r>
+        <w:rPr>
+          <w:lang w:val="en-GB"/>
+        </w:rPr>
+        <w:t>TickoJet</w:t>
+      </w:r>
+      <w:proofErr w:type="spellEnd"/>
+      <w:r>
+        <w:rPr>
+          <w:lang w:val="en-GB"/>
+        </w:rPr>
+        <w:t>-Android" &gt;&gt; README.md</w:t>
+      </w:r>
+    </w:p>
+    <w:p>
+      <w:pPr>
+        <w:rPr>
+          <w:lang w:val="en-GB"/>
+        </w:rPr>
+      </w:pPr>
+      <w:r>
+        <w:rPr>
+          <w:lang w:val="en-GB"/>
+        </w:rPr>
+        <w:t xml:space="preserve">git </w:t>
+      </w:r>
+      <w:proofErr w:type="spellStart"/>
+      <w:r>
+        <w:rPr>
+          <w:lang w:val="en-GB"/>
+        </w:rPr>
+        <w:t>init</w:t>
+      </w:r>
+      <w:proofErr w:type="spellEnd"/>
+    </w:p>
+    <w:p>
+      <w:pPr>
+        <w:rPr>
+          <w:lang w:val="en-GB"/>
+        </w:rPr>
+      </w:pPr>
+      <w:r>
+        <w:rPr>
+          <w:lang w:val="en-GB"/>
+        </w:rPr>
+        <w:t xml:space="preserve">git </w:t>
+      </w:r>
+      <w:proofErr w:type="gramStart"/>
+      <w:r>
+        <w:rPr>
+          <w:lang w:val="en-GB"/>
+        </w:rPr>
+        <w:t xml:space="preserve">add </w:t>
+      </w:r>
+      <w:r>
+        <w:rPr>
+          <w:lang w:val="en-GB"/>
+        </w:rPr>
+        <w:t>.</w:t>
+      </w:r>
+      <w:proofErr w:type="gramEnd"/>
+    </w:p>
+    <w:p>
+      <w:pPr>
+        <w:rPr>
+          <w:lang w:val="en-GB"/>
+        </w:rPr>
+      </w:pPr>
+      <w:r>
+        <w:rPr>
+          <w:lang w:val="en-GB"/>
+        </w:rPr>
+        <w:t>git commit -m "</w:t>
+      </w:r>
+      <w:r>
+        <w:rPr>
+          <w:lang w:val="en-GB"/>
+        </w:rPr>
+        <w:t>Dashboard screen</w:t>
+      </w:r>
+      <w:r>
+        <w:rPr>
+          <w:lang w:val="en-GB"/>
+        </w:rPr>
+        <w:t>"</w:t>
+      </w:r>
+    </w:p>
+    <w:p>
+      <w:pPr>
+        <w:rPr>
+          <w:lang w:val="en-GB"/>
+        </w:rPr>
+      </w:pPr>
+      <w:r>
+        <w:rPr>
+          <w:lang w:val="en-GB"/>
+        </w:rPr>
+        <w:t xml:space="preserve">git branch -M </w:t>
+      </w:r>
+      <w:r>
+        <w:rPr>
+          <w:lang w:val="en-GB"/>
+        </w:rPr>
+        <w:t>dev</w:t>
+      </w:r>
+    </w:p>
+    <w:p>
+      <w:pPr>
+        <w:rPr>
+          <w:lang w:val="en-GB"/>
+        </w:rPr>
+      </w:pPr>
+      <w:r>
+        <w:rPr>
+          <w:lang w:val="en-GB"/>
+        </w:rPr>
+        <w:t>git remote add origin https://github.com/Progambler227788/TickoJet-Android.git</w:t>
+      </w:r>
+    </w:p>
+    <w:p>
+      <w:pPr>
+        <w:rPr>
+          <w:lang w:val="en-GB"/>
+        </w:rPr>
+      </w:pPr>
+      <w:r>
+        <w:rPr>
+          <w:lang w:val="en-GB"/>
+        </w:rPr>
+        <w:t xml:space="preserve">git push -u origin </w:t>
+      </w:r>
+      <w:r>
+        <w:rPr>
+          <w:lang w:val="en-GB"/>
+        </w:rPr>
+        <w:t>dev</w:t>
+      </w:r>
     </w:p>
     <w:p>
       <w:pPr>

</xml_diff>

<commit_message>
Added login, signup, activity for booking events and seats, added font, added drawables, added github external dependencies for image slider and circular image
</commit_message>
<xml_diff>
--- a/Documentation.docx
+++ b/Documentation.docx
@@ -132,14 +132,7 @@
         <w:rPr>
           <w:lang w:val="en-GB"/>
         </w:rPr>
-        <w:t xml:space="preserve">git </w:t>
-      </w:r>
-      <w:proofErr w:type="gramStart"/>
-      <w:r>
-        <w:rPr>
-          <w:lang w:val="en-GB"/>
-        </w:rPr>
-        <w:t xml:space="preserve">add </w:t>
+        <w:t xml:space="preserve">git add </w:t>
       </w:r>
       <w:r>
         <w:rPr>
@@ -147,7 +140,6 @@
         </w:rPr>
         <w:t>.</w:t>
       </w:r>
-      <w:proofErr w:type="gramEnd"/>
     </w:p>
     <w:p>
       <w:pPr>
@@ -224,6 +216,965 @@
         </w:rPr>
         <w:t>dev</w:t>
       </w:r>
+    </w:p>
+    <w:p>
+      <w:pPr>
+        <w:rPr>
+          <w:lang w:val="en-GB"/>
+        </w:rPr>
+      </w:pPr>
+    </w:p>
+    <w:p>
+      <w:pPr>
+        <w:rPr>
+          <w:lang w:val="en-GB"/>
+        </w:rPr>
+      </w:pPr>
+      <w:r>
+        <w:rPr>
+          <w:lang w:val="en-GB"/>
+        </w:rPr>
+        <w:t xml:space="preserve">Login </w:t>
+      </w:r>
+    </w:p>
+    <w:p>
+      <w:pPr>
+        <w:rPr>
+          <w:lang w:val="en-GB"/>
+        </w:rPr>
+      </w:pPr>
+      <w:r>
+        <w:rPr>
+          <w:lang w:val="en-GB"/>
+        </w:rPr>
+        <w:t>Sign-Up</w:t>
+      </w:r>
+    </w:p>
+    <w:p>
+      <w:pPr>
+        <w:rPr>
+          <w:lang w:val="en-GB"/>
+        </w:rPr>
+      </w:pPr>
+    </w:p>
+    <w:p>
+      <w:pPr>
+        <w:rPr>
+          <w:lang w:val="en-GB"/>
+        </w:rPr>
+      </w:pPr>
+    </w:p>
+    <w:p>
+      <w:pPr>
+        <w:rPr>
+          <w:lang w:val="en-GB"/>
+        </w:rPr>
+      </w:pPr>
+    </w:p>
+    <w:p>
+      <w:pPr>
+        <w:rPr>
+          <w:lang w:val="en-GB"/>
+        </w:rPr>
+      </w:pPr>
+      <w:r>
+        <w:rPr>
+          <w:lang w:val="en-GB"/>
+        </w:rPr>
+        <w:lastRenderedPageBreak/>
+        <w:drawing>
+          <wp:inline distT="0" distB="0" distL="0" distR="0" wp14:anchorId="641AE1B4" wp14:editId="7651A428">
+            <wp:extent cx="4515480" cy="8554644"/>
+            <wp:effectExtent l="0" t="0" r="0" b="0"/>
+            <wp:docPr id="1" name="Picture 1"/>
+            <wp:cNvGraphicFramePr>
+              <a:graphicFrameLocks xmlns:a="http://schemas.openxmlformats.org/drawingml/2006/main" noChangeAspect="1"/>
+            </wp:cNvGraphicFramePr>
+            <a:graphic xmlns:a="http://schemas.openxmlformats.org/drawingml/2006/main">
+              <a:graphicData uri="http://schemas.openxmlformats.org/drawingml/2006/picture">
+                <pic:pic xmlns:pic="http://schemas.openxmlformats.org/drawingml/2006/picture">
+                  <pic:nvPicPr>
+                    <pic:cNvPr id="1" name=""/>
+                    <pic:cNvPicPr/>
+                  </pic:nvPicPr>
+                  <pic:blipFill>
+                    <a:blip r:embed="rId7"/>
+                    <a:stretch>
+                      <a:fillRect/>
+                    </a:stretch>
+                  </pic:blipFill>
+                  <pic:spPr>
+                    <a:xfrm>
+                      <a:off x="0" y="0"/>
+                      <a:ext cx="4515480" cy="8554644"/>
+                    </a:xfrm>
+                    <a:prstGeom prst="rect">
+                      <a:avLst/>
+                    </a:prstGeom>
+                  </pic:spPr>
+                </pic:pic>
+              </a:graphicData>
+            </a:graphic>
+          </wp:inline>
+        </w:drawing>
+      </w:r>
+    </w:p>
+    <w:p>
+      <w:pPr>
+        <w:rPr>
+          <w:lang w:val="en-GB"/>
+        </w:rPr>
+      </w:pPr>
+    </w:p>
+    <w:p>
+      <w:pPr>
+        <w:rPr>
+          <w:lang w:val="en-GB"/>
+        </w:rPr>
+      </w:pPr>
+      <w:r>
+        <w:rPr>
+          <w:lang w:val="en-GB"/>
+        </w:rPr>
+        <w:lastRenderedPageBreak/>
+        <w:drawing>
+          <wp:inline distT="0" distB="0" distL="0" distR="0" wp14:anchorId="1FF22606" wp14:editId="27A97033">
+            <wp:extent cx="4258269" cy="8316486"/>
+            <wp:effectExtent l="0" t="0" r="9525" b="8890"/>
+            <wp:docPr id="2" name="Picture 2"/>
+            <wp:cNvGraphicFramePr>
+              <a:graphicFrameLocks xmlns:a="http://schemas.openxmlformats.org/drawingml/2006/main" noChangeAspect="1"/>
+            </wp:cNvGraphicFramePr>
+            <a:graphic xmlns:a="http://schemas.openxmlformats.org/drawingml/2006/main">
+              <a:graphicData uri="http://schemas.openxmlformats.org/drawingml/2006/picture">
+                <pic:pic xmlns:pic="http://schemas.openxmlformats.org/drawingml/2006/picture">
+                  <pic:nvPicPr>
+                    <pic:cNvPr id="1" name=""/>
+                    <pic:cNvPicPr/>
+                  </pic:nvPicPr>
+                  <pic:blipFill>
+                    <a:blip r:embed="rId8"/>
+                    <a:stretch>
+                      <a:fillRect/>
+                    </a:stretch>
+                  </pic:blipFill>
+                  <pic:spPr>
+                    <a:xfrm>
+                      <a:off x="0" y="0"/>
+                      <a:ext cx="4258269" cy="8316486"/>
+                    </a:xfrm>
+                    <a:prstGeom prst="rect">
+                      <a:avLst/>
+                    </a:prstGeom>
+                  </pic:spPr>
+                </pic:pic>
+              </a:graphicData>
+            </a:graphic>
+          </wp:inline>
+        </w:drawing>
+      </w:r>
+    </w:p>
+    <w:p>
+      <w:pPr>
+        <w:rPr>
+          <w:lang w:val="en-GB"/>
+        </w:rPr>
+      </w:pPr>
+    </w:p>
+    <w:p>
+      <w:pPr>
+        <w:rPr>
+          <w:lang w:val="en-GB"/>
+        </w:rPr>
+      </w:pPr>
+      <w:r>
+        <w:rPr>
+          <w:lang w:val="en-GB"/>
+        </w:rPr>
+        <w:lastRenderedPageBreak/>
+        <w:drawing>
+          <wp:inline distT="0" distB="0" distL="0" distR="0" wp14:anchorId="110C7922" wp14:editId="268FD968">
+            <wp:extent cx="4258269" cy="6782747"/>
+            <wp:effectExtent l="0" t="0" r="9525" b="0"/>
+            <wp:docPr id="3" name="Picture 3"/>
+            <wp:cNvGraphicFramePr>
+              <a:graphicFrameLocks xmlns:a="http://schemas.openxmlformats.org/drawingml/2006/main" noChangeAspect="1"/>
+            </wp:cNvGraphicFramePr>
+            <a:graphic xmlns:a="http://schemas.openxmlformats.org/drawingml/2006/main">
+              <a:graphicData uri="http://schemas.openxmlformats.org/drawingml/2006/picture">
+                <pic:pic xmlns:pic="http://schemas.openxmlformats.org/drawingml/2006/picture">
+                  <pic:nvPicPr>
+                    <pic:cNvPr id="1" name=""/>
+                    <pic:cNvPicPr/>
+                  </pic:nvPicPr>
+                  <pic:blipFill>
+                    <a:blip r:embed="rId9"/>
+                    <a:stretch>
+                      <a:fillRect/>
+                    </a:stretch>
+                  </pic:blipFill>
+                  <pic:spPr>
+                    <a:xfrm>
+                      <a:off x="0" y="0"/>
+                      <a:ext cx="4258269" cy="6782747"/>
+                    </a:xfrm>
+                    <a:prstGeom prst="rect">
+                      <a:avLst/>
+                    </a:prstGeom>
+                  </pic:spPr>
+                </pic:pic>
+              </a:graphicData>
+            </a:graphic>
+          </wp:inline>
+        </w:drawing>
+      </w:r>
+    </w:p>
+    <w:p>
+      <w:pPr>
+        <w:rPr>
+          <w:lang w:val="en-GB"/>
+        </w:rPr>
+      </w:pPr>
+      <w:r>
+        <w:rPr>
+          <w:lang w:val="en-GB"/>
+        </w:rPr>
+        <w:lastRenderedPageBreak/>
+        <w:drawing>
+          <wp:inline distT="0" distB="0" distL="0" distR="0" wp14:anchorId="612B43DA" wp14:editId="53D6EBB2">
+            <wp:extent cx="4029637" cy="8002117"/>
+            <wp:effectExtent l="0" t="0" r="9525" b="0"/>
+            <wp:docPr id="4" name="Picture 4"/>
+            <wp:cNvGraphicFramePr>
+              <a:graphicFrameLocks xmlns:a="http://schemas.openxmlformats.org/drawingml/2006/main" noChangeAspect="1"/>
+            </wp:cNvGraphicFramePr>
+            <a:graphic xmlns:a="http://schemas.openxmlformats.org/drawingml/2006/main">
+              <a:graphicData uri="http://schemas.openxmlformats.org/drawingml/2006/picture">
+                <pic:pic xmlns:pic="http://schemas.openxmlformats.org/drawingml/2006/picture">
+                  <pic:nvPicPr>
+                    <pic:cNvPr id="1" name=""/>
+                    <pic:cNvPicPr/>
+                  </pic:nvPicPr>
+                  <pic:blipFill>
+                    <a:blip r:embed="rId10"/>
+                    <a:stretch>
+                      <a:fillRect/>
+                    </a:stretch>
+                  </pic:blipFill>
+                  <pic:spPr>
+                    <a:xfrm>
+                      <a:off x="0" y="0"/>
+                      <a:ext cx="4029637" cy="8002117"/>
+                    </a:xfrm>
+                    <a:prstGeom prst="rect">
+                      <a:avLst/>
+                    </a:prstGeom>
+                  </pic:spPr>
+                </pic:pic>
+              </a:graphicData>
+            </a:graphic>
+          </wp:inline>
+        </w:drawing>
+      </w:r>
+    </w:p>
+    <w:p>
+      <w:pPr>
+        <w:rPr>
+          <w:lang w:val="en-GB"/>
+        </w:rPr>
+      </w:pPr>
+    </w:p>
+    <w:p>
+      <w:pPr>
+        <w:rPr>
+          <w:lang w:val="en-GB"/>
+        </w:rPr>
+      </w:pPr>
+      <w:r>
+        <w:rPr>
+          <w:lang w:val="en-GB"/>
+        </w:rPr>
+        <w:lastRenderedPageBreak/>
+        <w:drawing>
+          <wp:inline distT="0" distB="0" distL="0" distR="0" wp14:anchorId="0B89BFD4" wp14:editId="3E90F112">
+            <wp:extent cx="2876951" cy="5306165"/>
+            <wp:effectExtent l="0" t="0" r="0" b="8890"/>
+            <wp:docPr id="18" name="Picture 18"/>
+            <wp:cNvGraphicFramePr>
+              <a:graphicFrameLocks xmlns:a="http://schemas.openxmlformats.org/drawingml/2006/main" noChangeAspect="1"/>
+            </wp:cNvGraphicFramePr>
+            <a:graphic xmlns:a="http://schemas.openxmlformats.org/drawingml/2006/main">
+              <a:graphicData uri="http://schemas.openxmlformats.org/drawingml/2006/picture">
+                <pic:pic xmlns:pic="http://schemas.openxmlformats.org/drawingml/2006/picture">
+                  <pic:nvPicPr>
+                    <pic:cNvPr id="1" name=""/>
+                    <pic:cNvPicPr/>
+                  </pic:nvPicPr>
+                  <pic:blipFill>
+                    <a:blip r:embed="rId11"/>
+                    <a:stretch>
+                      <a:fillRect/>
+                    </a:stretch>
+                  </pic:blipFill>
+                  <pic:spPr>
+                    <a:xfrm>
+                      <a:off x="0" y="0"/>
+                      <a:ext cx="2876951" cy="5306165"/>
+                    </a:xfrm>
+                    <a:prstGeom prst="rect">
+                      <a:avLst/>
+                    </a:prstGeom>
+                  </pic:spPr>
+                </pic:pic>
+              </a:graphicData>
+            </a:graphic>
+          </wp:inline>
+        </w:drawing>
+      </w:r>
+    </w:p>
+    <w:p>
+      <w:pPr>
+        <w:rPr>
+          <w:lang w:val="en-GB"/>
+        </w:rPr>
+      </w:pPr>
+      <w:r>
+        <w:rPr>
+          <w:lang w:val="en-GB"/>
+        </w:rPr>
+        <w:lastRenderedPageBreak/>
+        <w:drawing>
+          <wp:inline distT="0" distB="0" distL="0" distR="0" wp14:anchorId="4C4983B3" wp14:editId="3B4E3A80">
+            <wp:extent cx="4324954" cy="7954485"/>
+            <wp:effectExtent l="0" t="0" r="0" b="0"/>
+            <wp:docPr id="5" name="Picture 5"/>
+            <wp:cNvGraphicFramePr>
+              <a:graphicFrameLocks xmlns:a="http://schemas.openxmlformats.org/drawingml/2006/main" noChangeAspect="1"/>
+            </wp:cNvGraphicFramePr>
+            <a:graphic xmlns:a="http://schemas.openxmlformats.org/drawingml/2006/main">
+              <a:graphicData uri="http://schemas.openxmlformats.org/drawingml/2006/picture">
+                <pic:pic xmlns:pic="http://schemas.openxmlformats.org/drawingml/2006/picture">
+                  <pic:nvPicPr>
+                    <pic:cNvPr id="1" name=""/>
+                    <pic:cNvPicPr/>
+                  </pic:nvPicPr>
+                  <pic:blipFill>
+                    <a:blip r:embed="rId12"/>
+                    <a:stretch>
+                      <a:fillRect/>
+                    </a:stretch>
+                  </pic:blipFill>
+                  <pic:spPr>
+                    <a:xfrm>
+                      <a:off x="0" y="0"/>
+                      <a:ext cx="4324954" cy="7954485"/>
+                    </a:xfrm>
+                    <a:prstGeom prst="rect">
+                      <a:avLst/>
+                    </a:prstGeom>
+                  </pic:spPr>
+                </pic:pic>
+              </a:graphicData>
+            </a:graphic>
+          </wp:inline>
+        </w:drawing>
+      </w:r>
+    </w:p>
+    <w:p>
+      <w:pPr>
+        <w:rPr>
+          <w:lang w:val="en-GB"/>
+        </w:rPr>
+      </w:pPr>
+      <w:r>
+        <w:rPr>
+          <w:lang w:val="en-GB"/>
+        </w:rPr>
+        <w:lastRenderedPageBreak/>
+        <w:drawing>
+          <wp:inline distT="0" distB="0" distL="0" distR="0" wp14:anchorId="48C247C7" wp14:editId="60487E40">
+            <wp:extent cx="4839375" cy="6868484"/>
+            <wp:effectExtent l="0" t="0" r="0" b="8890"/>
+            <wp:docPr id="6" name="Picture 6"/>
+            <wp:cNvGraphicFramePr>
+              <a:graphicFrameLocks xmlns:a="http://schemas.openxmlformats.org/drawingml/2006/main" noChangeAspect="1"/>
+            </wp:cNvGraphicFramePr>
+            <a:graphic xmlns:a="http://schemas.openxmlformats.org/drawingml/2006/main">
+              <a:graphicData uri="http://schemas.openxmlformats.org/drawingml/2006/picture">
+                <pic:pic xmlns:pic="http://schemas.openxmlformats.org/drawingml/2006/picture">
+                  <pic:nvPicPr>
+                    <pic:cNvPr id="1" name=""/>
+                    <pic:cNvPicPr/>
+                  </pic:nvPicPr>
+                  <pic:blipFill>
+                    <a:blip r:embed="rId13"/>
+                    <a:stretch>
+                      <a:fillRect/>
+                    </a:stretch>
+                  </pic:blipFill>
+                  <pic:spPr>
+                    <a:xfrm>
+                      <a:off x="0" y="0"/>
+                      <a:ext cx="4839375" cy="6868484"/>
+                    </a:xfrm>
+                    <a:prstGeom prst="rect">
+                      <a:avLst/>
+                    </a:prstGeom>
+                  </pic:spPr>
+                </pic:pic>
+              </a:graphicData>
+            </a:graphic>
+          </wp:inline>
+        </w:drawing>
+      </w:r>
+    </w:p>
+    <w:p>
+      <w:pPr>
+        <w:rPr>
+          <w:lang w:val="en-GB"/>
+        </w:rPr>
+      </w:pPr>
+      <w:r>
+        <w:rPr>
+          <w:lang w:val="en-GB"/>
+        </w:rPr>
+        <w:lastRenderedPageBreak/>
+        <w:drawing>
+          <wp:inline distT="0" distB="0" distL="0" distR="0" wp14:anchorId="51E30B34" wp14:editId="0E319C04">
+            <wp:extent cx="4753638" cy="6182588"/>
+            <wp:effectExtent l="0" t="0" r="8890" b="8890"/>
+            <wp:docPr id="7" name="Picture 7"/>
+            <wp:cNvGraphicFramePr>
+              <a:graphicFrameLocks xmlns:a="http://schemas.openxmlformats.org/drawingml/2006/main" noChangeAspect="1"/>
+            </wp:cNvGraphicFramePr>
+            <a:graphic xmlns:a="http://schemas.openxmlformats.org/drawingml/2006/main">
+              <a:graphicData uri="http://schemas.openxmlformats.org/drawingml/2006/picture">
+                <pic:pic xmlns:pic="http://schemas.openxmlformats.org/drawingml/2006/picture">
+                  <pic:nvPicPr>
+                    <pic:cNvPr id="1" name=""/>
+                    <pic:cNvPicPr/>
+                  </pic:nvPicPr>
+                  <pic:blipFill>
+                    <a:blip r:embed="rId14"/>
+                    <a:stretch>
+                      <a:fillRect/>
+                    </a:stretch>
+                  </pic:blipFill>
+                  <pic:spPr>
+                    <a:xfrm>
+                      <a:off x="0" y="0"/>
+                      <a:ext cx="4753638" cy="6182588"/>
+                    </a:xfrm>
+                    <a:prstGeom prst="rect">
+                      <a:avLst/>
+                    </a:prstGeom>
+                  </pic:spPr>
+                </pic:pic>
+              </a:graphicData>
+            </a:graphic>
+          </wp:inline>
+        </w:drawing>
+      </w:r>
+    </w:p>
+    <w:p>
+      <w:pPr>
+        <w:rPr>
+          <w:lang w:val="en-GB"/>
+        </w:rPr>
+      </w:pPr>
+      <w:r>
+        <w:rPr>
+          <w:lang w:val="en-GB"/>
+        </w:rPr>
+        <w:lastRenderedPageBreak/>
+        <w:drawing>
+          <wp:inline distT="0" distB="0" distL="0" distR="0" wp14:anchorId="1005FC4C" wp14:editId="50ACB032">
+            <wp:extent cx="4058216" cy="7763958"/>
+            <wp:effectExtent l="0" t="0" r="0" b="8890"/>
+            <wp:docPr id="8" name="Picture 8"/>
+            <wp:cNvGraphicFramePr>
+              <a:graphicFrameLocks xmlns:a="http://schemas.openxmlformats.org/drawingml/2006/main" noChangeAspect="1"/>
+            </wp:cNvGraphicFramePr>
+            <a:graphic xmlns:a="http://schemas.openxmlformats.org/drawingml/2006/main">
+              <a:graphicData uri="http://schemas.openxmlformats.org/drawingml/2006/picture">
+                <pic:pic xmlns:pic="http://schemas.openxmlformats.org/drawingml/2006/picture">
+                  <pic:nvPicPr>
+                    <pic:cNvPr id="1" name=""/>
+                    <pic:cNvPicPr/>
+                  </pic:nvPicPr>
+                  <pic:blipFill>
+                    <a:blip r:embed="rId15"/>
+                    <a:stretch>
+                      <a:fillRect/>
+                    </a:stretch>
+                  </pic:blipFill>
+                  <pic:spPr>
+                    <a:xfrm>
+                      <a:off x="0" y="0"/>
+                      <a:ext cx="4058216" cy="7763958"/>
+                    </a:xfrm>
+                    <a:prstGeom prst="rect">
+                      <a:avLst/>
+                    </a:prstGeom>
+                  </pic:spPr>
+                </pic:pic>
+              </a:graphicData>
+            </a:graphic>
+          </wp:inline>
+        </w:drawing>
+      </w:r>
+    </w:p>
+    <w:p>
+      <w:pPr>
+        <w:rPr>
+          <w:lang w:val="en-GB"/>
+        </w:rPr>
+      </w:pPr>
+      <w:r>
+        <w:rPr>
+          <w:lang w:val="en-GB"/>
+        </w:rPr>
+        <w:lastRenderedPageBreak/>
+        <w:drawing>
+          <wp:inline distT="0" distB="0" distL="0" distR="0" wp14:anchorId="543FA371" wp14:editId="286E1457">
+            <wp:extent cx="4515480" cy="7897327"/>
+            <wp:effectExtent l="0" t="0" r="0" b="8890"/>
+            <wp:docPr id="9" name="Picture 9"/>
+            <wp:cNvGraphicFramePr>
+              <a:graphicFrameLocks xmlns:a="http://schemas.openxmlformats.org/drawingml/2006/main" noChangeAspect="1"/>
+            </wp:cNvGraphicFramePr>
+            <a:graphic xmlns:a="http://schemas.openxmlformats.org/drawingml/2006/main">
+              <a:graphicData uri="http://schemas.openxmlformats.org/drawingml/2006/picture">
+                <pic:pic xmlns:pic="http://schemas.openxmlformats.org/drawingml/2006/picture">
+                  <pic:nvPicPr>
+                    <pic:cNvPr id="1" name=""/>
+                    <pic:cNvPicPr/>
+                  </pic:nvPicPr>
+                  <pic:blipFill>
+                    <a:blip r:embed="rId16"/>
+                    <a:stretch>
+                      <a:fillRect/>
+                    </a:stretch>
+                  </pic:blipFill>
+                  <pic:spPr>
+                    <a:xfrm>
+                      <a:off x="0" y="0"/>
+                      <a:ext cx="4515480" cy="7897327"/>
+                    </a:xfrm>
+                    <a:prstGeom prst="rect">
+                      <a:avLst/>
+                    </a:prstGeom>
+                  </pic:spPr>
+                </pic:pic>
+              </a:graphicData>
+            </a:graphic>
+          </wp:inline>
+        </w:drawing>
+      </w:r>
+    </w:p>
+    <w:p>
+      <w:pPr>
+        <w:rPr>
+          <w:lang w:val="en-GB"/>
+        </w:rPr>
+      </w:pPr>
+    </w:p>
+    <w:p>
+      <w:pPr>
+        <w:rPr>
+          <w:lang w:val="en-GB"/>
+        </w:rPr>
+      </w:pPr>
+      <w:r>
+        <w:rPr>
+          <w:lang w:val="en-GB"/>
+        </w:rPr>
+        <w:lastRenderedPageBreak/>
+        <w:drawing>
+          <wp:inline distT="0" distB="0" distL="0" distR="0" wp14:anchorId="226D6F6E" wp14:editId="5B588A87">
+            <wp:extent cx="4906060" cy="8707065"/>
+            <wp:effectExtent l="0" t="0" r="8890" b="0"/>
+            <wp:docPr id="10" name="Picture 10"/>
+            <wp:cNvGraphicFramePr>
+              <a:graphicFrameLocks xmlns:a="http://schemas.openxmlformats.org/drawingml/2006/main" noChangeAspect="1"/>
+            </wp:cNvGraphicFramePr>
+            <a:graphic xmlns:a="http://schemas.openxmlformats.org/drawingml/2006/main">
+              <a:graphicData uri="http://schemas.openxmlformats.org/drawingml/2006/picture">
+                <pic:pic xmlns:pic="http://schemas.openxmlformats.org/drawingml/2006/picture">
+                  <pic:nvPicPr>
+                    <pic:cNvPr id="1" name=""/>
+                    <pic:cNvPicPr/>
+                  </pic:nvPicPr>
+                  <pic:blipFill>
+                    <a:blip r:embed="rId17"/>
+                    <a:stretch>
+                      <a:fillRect/>
+                    </a:stretch>
+                  </pic:blipFill>
+                  <pic:spPr>
+                    <a:xfrm>
+                      <a:off x="0" y="0"/>
+                      <a:ext cx="4906060" cy="8707065"/>
+                    </a:xfrm>
+                    <a:prstGeom prst="rect">
+                      <a:avLst/>
+                    </a:prstGeom>
+                  </pic:spPr>
+                </pic:pic>
+              </a:graphicData>
+            </a:graphic>
+          </wp:inline>
+        </w:drawing>
+      </w:r>
+    </w:p>
+    <w:p>
+      <w:pPr>
+        <w:rPr>
+          <w:lang w:val="en-GB"/>
+        </w:rPr>
+      </w:pPr>
+      <w:r>
+        <w:rPr>
+          <w:lang w:val="en-GB"/>
+        </w:rPr>
+        <w:lastRenderedPageBreak/>
+        <w:drawing>
+          <wp:inline distT="0" distB="0" distL="0" distR="0" wp14:anchorId="6252FB3E" wp14:editId="247D77B4">
+            <wp:extent cx="4953691" cy="3734321"/>
+            <wp:effectExtent l="0" t="0" r="0" b="0"/>
+            <wp:docPr id="11" name="Picture 11"/>
+            <wp:cNvGraphicFramePr>
+              <a:graphicFrameLocks xmlns:a="http://schemas.openxmlformats.org/drawingml/2006/main" noChangeAspect="1"/>
+            </wp:cNvGraphicFramePr>
+            <a:graphic xmlns:a="http://schemas.openxmlformats.org/drawingml/2006/main">
+              <a:graphicData uri="http://schemas.openxmlformats.org/drawingml/2006/picture">
+                <pic:pic xmlns:pic="http://schemas.openxmlformats.org/drawingml/2006/picture">
+                  <pic:nvPicPr>
+                    <pic:cNvPr id="1" name=""/>
+                    <pic:cNvPicPr/>
+                  </pic:nvPicPr>
+                  <pic:blipFill>
+                    <a:blip r:embed="rId18"/>
+                    <a:stretch>
+                      <a:fillRect/>
+                    </a:stretch>
+                  </pic:blipFill>
+                  <pic:spPr>
+                    <a:xfrm>
+                      <a:off x="0" y="0"/>
+                      <a:ext cx="4953691" cy="3734321"/>
+                    </a:xfrm>
+                    <a:prstGeom prst="rect">
+                      <a:avLst/>
+                    </a:prstGeom>
+                  </pic:spPr>
+                </pic:pic>
+              </a:graphicData>
+            </a:graphic>
+          </wp:inline>
+        </w:drawing>
+      </w:r>
+    </w:p>
+    <w:p>
+      <w:pPr>
+        <w:rPr>
+          <w:lang w:val="en-GB"/>
+        </w:rPr>
+      </w:pPr>
+      <w:r>
+        <w:rPr>
+          <w:lang w:val="en-GB"/>
+        </w:rPr>
+        <w:lastRenderedPageBreak/>
+        <w:drawing>
+          <wp:inline distT="0" distB="0" distL="0" distR="0" wp14:anchorId="2479E851" wp14:editId="73D22797">
+            <wp:extent cx="4267796" cy="7744906"/>
+            <wp:effectExtent l="0" t="0" r="0" b="0"/>
+            <wp:docPr id="12" name="Picture 12"/>
+            <wp:cNvGraphicFramePr>
+              <a:graphicFrameLocks xmlns:a="http://schemas.openxmlformats.org/drawingml/2006/main" noChangeAspect="1"/>
+            </wp:cNvGraphicFramePr>
+            <a:graphic xmlns:a="http://schemas.openxmlformats.org/drawingml/2006/main">
+              <a:graphicData uri="http://schemas.openxmlformats.org/drawingml/2006/picture">
+                <pic:pic xmlns:pic="http://schemas.openxmlformats.org/drawingml/2006/picture">
+                  <pic:nvPicPr>
+                    <pic:cNvPr id="1" name=""/>
+                    <pic:cNvPicPr/>
+                  </pic:nvPicPr>
+                  <pic:blipFill>
+                    <a:blip r:embed="rId19"/>
+                    <a:stretch>
+                      <a:fillRect/>
+                    </a:stretch>
+                  </pic:blipFill>
+                  <pic:spPr>
+                    <a:xfrm>
+                      <a:off x="0" y="0"/>
+                      <a:ext cx="4267796" cy="7744906"/>
+                    </a:xfrm>
+                    <a:prstGeom prst="rect">
+                      <a:avLst/>
+                    </a:prstGeom>
+                  </pic:spPr>
+                </pic:pic>
+              </a:graphicData>
+            </a:graphic>
+          </wp:inline>
+        </w:drawing>
+      </w:r>
+    </w:p>
+    <w:p>
+      <w:pPr>
+        <w:rPr>
+          <w:lang w:val="en-GB"/>
+        </w:rPr>
+      </w:pPr>
+      <w:r>
+        <w:rPr>
+          <w:lang w:val="en-GB"/>
+        </w:rPr>
+        <w:lastRenderedPageBreak/>
+        <w:drawing>
+          <wp:inline distT="0" distB="0" distL="0" distR="0" wp14:anchorId="0C34B7B8" wp14:editId="5D78D3C0">
+            <wp:extent cx="4763165" cy="5830114"/>
+            <wp:effectExtent l="0" t="0" r="0" b="0"/>
+            <wp:docPr id="13" name="Picture 13"/>
+            <wp:cNvGraphicFramePr>
+              <a:graphicFrameLocks xmlns:a="http://schemas.openxmlformats.org/drawingml/2006/main" noChangeAspect="1"/>
+            </wp:cNvGraphicFramePr>
+            <a:graphic xmlns:a="http://schemas.openxmlformats.org/drawingml/2006/main">
+              <a:graphicData uri="http://schemas.openxmlformats.org/drawingml/2006/picture">
+                <pic:pic xmlns:pic="http://schemas.openxmlformats.org/drawingml/2006/picture">
+                  <pic:nvPicPr>
+                    <pic:cNvPr id="1" name=""/>
+                    <pic:cNvPicPr/>
+                  </pic:nvPicPr>
+                  <pic:blipFill>
+                    <a:blip r:embed="rId20"/>
+                    <a:stretch>
+                      <a:fillRect/>
+                    </a:stretch>
+                  </pic:blipFill>
+                  <pic:spPr>
+                    <a:xfrm>
+                      <a:off x="0" y="0"/>
+                      <a:ext cx="4763165" cy="5830114"/>
+                    </a:xfrm>
+                    <a:prstGeom prst="rect">
+                      <a:avLst/>
+                    </a:prstGeom>
+                  </pic:spPr>
+                </pic:pic>
+              </a:graphicData>
+            </a:graphic>
+          </wp:inline>
+        </w:drawing>
+      </w:r>
+    </w:p>
+    <w:p>
+      <w:pPr>
+        <w:rPr>
+          <w:lang w:val="en-GB"/>
+        </w:rPr>
+      </w:pPr>
+      <w:r>
+        <w:rPr>
+          <w:lang w:val="en-GB"/>
+        </w:rPr>
+        <w:lastRenderedPageBreak/>
+        <w:drawing>
+          <wp:inline distT="0" distB="0" distL="0" distR="0" wp14:anchorId="4F1ACDBD" wp14:editId="5253BDED">
+            <wp:extent cx="4934639" cy="3372321"/>
+            <wp:effectExtent l="0" t="0" r="0" b="0"/>
+            <wp:docPr id="14" name="Picture 14"/>
+            <wp:cNvGraphicFramePr>
+              <a:graphicFrameLocks xmlns:a="http://schemas.openxmlformats.org/drawingml/2006/main" noChangeAspect="1"/>
+            </wp:cNvGraphicFramePr>
+            <a:graphic xmlns:a="http://schemas.openxmlformats.org/drawingml/2006/main">
+              <a:graphicData uri="http://schemas.openxmlformats.org/drawingml/2006/picture">
+                <pic:pic xmlns:pic="http://schemas.openxmlformats.org/drawingml/2006/picture">
+                  <pic:nvPicPr>
+                    <pic:cNvPr id="1" name=""/>
+                    <pic:cNvPicPr/>
+                  </pic:nvPicPr>
+                  <pic:blipFill>
+                    <a:blip r:embed="rId21"/>
+                    <a:stretch>
+                      <a:fillRect/>
+                    </a:stretch>
+                  </pic:blipFill>
+                  <pic:spPr>
+                    <a:xfrm>
+                      <a:off x="0" y="0"/>
+                      <a:ext cx="4934639" cy="3372321"/>
+                    </a:xfrm>
+                    <a:prstGeom prst="rect">
+                      <a:avLst/>
+                    </a:prstGeom>
+                  </pic:spPr>
+                </pic:pic>
+              </a:graphicData>
+            </a:graphic>
+          </wp:inline>
+        </w:drawing>
+      </w:r>
+    </w:p>
+    <w:p>
+      <w:pPr>
+        <w:rPr>
+          <w:lang w:val="en-GB"/>
+        </w:rPr>
+      </w:pPr>
+      <w:r>
+        <w:rPr>
+          <w:lang w:val="en-GB"/>
+        </w:rPr>
+        <w:lastRenderedPageBreak/>
+        <w:drawing>
+          <wp:inline distT="0" distB="0" distL="0" distR="0" wp14:anchorId="6105945B" wp14:editId="2E1958CD">
+            <wp:extent cx="5106113" cy="8335538"/>
+            <wp:effectExtent l="0" t="0" r="0" b="8890"/>
+            <wp:docPr id="15" name="Picture 15"/>
+            <wp:cNvGraphicFramePr>
+              <a:graphicFrameLocks xmlns:a="http://schemas.openxmlformats.org/drawingml/2006/main" noChangeAspect="1"/>
+            </wp:cNvGraphicFramePr>
+            <a:graphic xmlns:a="http://schemas.openxmlformats.org/drawingml/2006/main">
+              <a:graphicData uri="http://schemas.openxmlformats.org/drawingml/2006/picture">
+                <pic:pic xmlns:pic="http://schemas.openxmlformats.org/drawingml/2006/picture">
+                  <pic:nvPicPr>
+                    <pic:cNvPr id="1" name=""/>
+                    <pic:cNvPicPr/>
+                  </pic:nvPicPr>
+                  <pic:blipFill>
+                    <a:blip r:embed="rId22"/>
+                    <a:stretch>
+                      <a:fillRect/>
+                    </a:stretch>
+                  </pic:blipFill>
+                  <pic:spPr>
+                    <a:xfrm>
+                      <a:off x="0" y="0"/>
+                      <a:ext cx="5106113" cy="8335538"/>
+                    </a:xfrm>
+                    <a:prstGeom prst="rect">
+                      <a:avLst/>
+                    </a:prstGeom>
+                  </pic:spPr>
+                </pic:pic>
+              </a:graphicData>
+            </a:graphic>
+          </wp:inline>
+        </w:drawing>
+      </w:r>
+    </w:p>
+    <w:p>
+      <w:pPr>
+        <w:rPr>
+          <w:lang w:val="en-GB"/>
+        </w:rPr>
+      </w:pPr>
+      <w:r>
+        <w:rPr>
+          <w:lang w:val="en-GB"/>
+        </w:rPr>
+        <w:lastRenderedPageBreak/>
+        <w:drawing>
+          <wp:inline distT="0" distB="0" distL="0" distR="0" wp14:anchorId="2D47BF4F" wp14:editId="3482FB1D">
+            <wp:extent cx="4182059" cy="5496692"/>
+            <wp:effectExtent l="0" t="0" r="9525" b="0"/>
+            <wp:docPr id="16" name="Picture 16"/>
+            <wp:cNvGraphicFramePr>
+              <a:graphicFrameLocks xmlns:a="http://schemas.openxmlformats.org/drawingml/2006/main" noChangeAspect="1"/>
+            </wp:cNvGraphicFramePr>
+            <a:graphic xmlns:a="http://schemas.openxmlformats.org/drawingml/2006/main">
+              <a:graphicData uri="http://schemas.openxmlformats.org/drawingml/2006/picture">
+                <pic:pic xmlns:pic="http://schemas.openxmlformats.org/drawingml/2006/picture">
+                  <pic:nvPicPr>
+                    <pic:cNvPr id="1" name=""/>
+                    <pic:cNvPicPr/>
+                  </pic:nvPicPr>
+                  <pic:blipFill>
+                    <a:blip r:embed="rId23"/>
+                    <a:stretch>
+                      <a:fillRect/>
+                    </a:stretch>
+                  </pic:blipFill>
+                  <pic:spPr>
+                    <a:xfrm>
+                      <a:off x="0" y="0"/>
+                      <a:ext cx="4182059" cy="5496692"/>
+                    </a:xfrm>
+                    <a:prstGeom prst="rect">
+                      <a:avLst/>
+                    </a:prstGeom>
+                  </pic:spPr>
+                </pic:pic>
+              </a:graphicData>
+            </a:graphic>
+          </wp:inline>
+        </w:drawing>
+      </w:r>
+    </w:p>
+    <w:p>
+      <w:pPr>
+        <w:rPr>
+          <w:lang w:val="en-GB"/>
+        </w:rPr>
+      </w:pPr>
+      <w:r>
+        <w:rPr>
+          <w:lang w:val="en-GB"/>
+        </w:rPr>
+        <w:lastRenderedPageBreak/>
+        <w:drawing>
+          <wp:inline distT="0" distB="0" distL="0" distR="0" wp14:anchorId="1EF2C308" wp14:editId="6230CADE">
+            <wp:extent cx="4887007" cy="7516274"/>
+            <wp:effectExtent l="0" t="0" r="8890" b="8890"/>
+            <wp:docPr id="17" name="Picture 17"/>
+            <wp:cNvGraphicFramePr>
+              <a:graphicFrameLocks xmlns:a="http://schemas.openxmlformats.org/drawingml/2006/main" noChangeAspect="1"/>
+            </wp:cNvGraphicFramePr>
+            <a:graphic xmlns:a="http://schemas.openxmlformats.org/drawingml/2006/main">
+              <a:graphicData uri="http://schemas.openxmlformats.org/drawingml/2006/picture">
+                <pic:pic xmlns:pic="http://schemas.openxmlformats.org/drawingml/2006/picture">
+                  <pic:nvPicPr>
+                    <pic:cNvPr id="1" name=""/>
+                    <pic:cNvPicPr/>
+                  </pic:nvPicPr>
+                  <pic:blipFill>
+                    <a:blip r:embed="rId24"/>
+                    <a:stretch>
+                      <a:fillRect/>
+                    </a:stretch>
+                  </pic:blipFill>
+                  <pic:spPr>
+                    <a:xfrm>
+                      <a:off x="0" y="0"/>
+                      <a:ext cx="4887007" cy="7516274"/>
+                    </a:xfrm>
+                    <a:prstGeom prst="rect">
+                      <a:avLst/>
+                    </a:prstGeom>
+                  </pic:spPr>
+                </pic:pic>
+              </a:graphicData>
+            </a:graphic>
+          </wp:inline>
+        </w:drawing>
+      </w:r>
+      <w:r>
+        <w:rPr>
+          <w:lang w:val="en-GB"/>
+        </w:rPr>
+        <w:softHyphen/>
+      </w:r>
+    </w:p>
+    <w:p>
+      <w:pPr>
+        <w:rPr>
+          <w:lang w:val="en-GB"/>
+        </w:rPr>
+      </w:pPr>
     </w:p>
     <w:p>
       <w:pPr>
@@ -1434,6 +2385,18 @@
       <w:shd w:val="clear" w:color="auto" w:fill="E1DFDD"/>
     </w:rPr>
   </w:style>
+  <w:style w:type="character" w:styleId="FollowedHyperlink">
+    <w:name w:val="FollowedHyperlink"/>
+    <w:basedOn w:val="DefaultParagraphFont"/>
+    <w:uiPriority w:val="99"/>
+    <w:semiHidden/>
+    <w:unhideWhenUsed/>
+    <w:rsid w:val="000D77BD"/>
+    <w:rPr>
+      <w:color w:val="954F72" w:themeColor="followedHyperlink"/>
+      <w:u w:val="single"/>
+    </w:rPr>
+  </w:style>
 </w:styles>
 </file>
 

</xml_diff>

<commit_message>
Added booking screen UI
</commit_message>
<xml_diff>
--- a/Documentation.docx
+++ b/Documentation.docx
@@ -54,6 +54,7 @@
     <w:p>
       <w:pPr>
         <w:rPr>
+          <w:rStyle w:val="Hyperlink"/>
           <w:lang w:val="en-GB"/>
         </w:rPr>
       </w:pPr>
@@ -66,6 +67,19 @@
           <w:t>https://dribbble.com/shots/25700245-Eventure-A-Smart-Mobile-App-for-Effortless-Event-Booking</w:t>
         </w:r>
       </w:hyperlink>
+    </w:p>
+    <w:p>
+      <w:pPr>
+        <w:rPr>
+          <w:lang w:val="en-GB"/>
+        </w:rPr>
+      </w:pPr>
+      <w:r>
+        <w:rPr>
+          <w:lang w:val="en-GB"/>
+        </w:rPr>
+        <w:t>https://codecanyon.net/item/evanoevent-booking-react-native-cli-ui-kit/44958054</w:t>
+      </w:r>
     </w:p>
     <w:p>
       <w:pPr>

</xml_diff>

<commit_message>
Trending Events Display, Animation, Bottom Nav Bar
</commit_message>
<xml_diff>
--- a/Documentation.docx
+++ b/Documentation.docx
@@ -8,6 +8,14 @@
           <w:lang w:val="en-GB"/>
         </w:rPr>
       </w:pPr>
+      <w:r>
+        <w:rPr>
+          <w:b/>
+          <w:bCs/>
+          <w:lang w:val="en-GB"/>
+        </w:rPr>
+        <w:softHyphen/>
+      </w:r>
       <w:r>
         <w:rPr>
           <w:b/>
@@ -98,43 +106,21 @@
         <w:rPr>
           <w:lang w:val="en-GB"/>
         </w:rPr>
-        <w:t xml:space="preserve">echo "# </w:t>
-      </w:r>
-      <w:proofErr w:type="spellStart"/>
-      <w:r>
-        <w:rPr>
-          <w:lang w:val="en-GB"/>
-        </w:rPr>
-        <w:t>TickoJet</w:t>
-      </w:r>
-      <w:proofErr w:type="spellEnd"/>
-      <w:r>
-        <w:rPr>
-          <w:lang w:val="en-GB"/>
-        </w:rPr>
-        <w:t>-Android" &gt;&gt; README.md</w:t>
-      </w:r>
-    </w:p>
-    <w:p>
-      <w:pPr>
-        <w:rPr>
-          <w:lang w:val="en-GB"/>
-        </w:rPr>
-      </w:pPr>
-      <w:r>
-        <w:rPr>
-          <w:lang w:val="en-GB"/>
-        </w:rPr>
-        <w:t xml:space="preserve">git </w:t>
-      </w:r>
-      <w:proofErr w:type="spellStart"/>
-      <w:r>
-        <w:rPr>
-          <w:lang w:val="en-GB"/>
-        </w:rPr>
-        <w:t>init</w:t>
-      </w:r>
-      <w:proofErr w:type="spellEnd"/>
+        <w:t>echo "# TickoJet-Android" &gt;&gt; README.md</w:t>
+      </w:r>
+    </w:p>
+    <w:p>
+      <w:pPr>
+        <w:rPr>
+          <w:lang w:val="en-GB"/>
+        </w:rPr>
+      </w:pPr>
+      <w:r>
+        <w:rPr>
+          <w:lang w:val="en-GB"/>
+        </w:rPr>
+        <w:t>git init</w:t>
+      </w:r>
     </w:p>
     <w:p>
       <w:pPr>
@@ -263,27 +249,6 @@
         </w:rPr>
         <w:t>Sign-Up</w:t>
       </w:r>
-    </w:p>
-    <w:p>
-      <w:pPr>
-        <w:rPr>
-          <w:lang w:val="en-GB"/>
-        </w:rPr>
-      </w:pPr>
-    </w:p>
-    <w:p>
-      <w:pPr>
-        <w:rPr>
-          <w:lang w:val="en-GB"/>
-        </w:rPr>
-      </w:pPr>
-    </w:p>
-    <w:p>
-      <w:pPr>
-        <w:rPr>
-          <w:lang w:val="en-GB"/>
-        </w:rPr>
-      </w:pPr>
     </w:p>
     <w:p>
       <w:pPr>
@@ -297,10 +262,10 @@
         </w:rPr>
         <w:lastRenderedPageBreak/>
         <w:drawing>
-          <wp:inline distT="0" distB="0" distL="0" distR="0" wp14:anchorId="641AE1B4" wp14:editId="7651A428">
-            <wp:extent cx="4515480" cy="8554644"/>
-            <wp:effectExtent l="0" t="0" r="0" b="0"/>
-            <wp:docPr id="1" name="Picture 1"/>
+          <wp:inline distT="0" distB="0" distL="0" distR="0" wp14:anchorId="4424BEBC" wp14:editId="50B61042">
+            <wp:extent cx="3343742" cy="4220164"/>
+            <wp:effectExtent l="0" t="0" r="9525" b="9525"/>
+            <wp:docPr id="19" name="Picture 19"/>
             <wp:cNvGraphicFramePr>
               <a:graphicFrameLocks xmlns:a="http://schemas.openxmlformats.org/drawingml/2006/main" noChangeAspect="1"/>
             </wp:cNvGraphicFramePr>
@@ -320,7 +285,7 @@
                   <pic:spPr>
                     <a:xfrm>
                       <a:off x="0" y="0"/>
-                      <a:ext cx="4515480" cy="8554644"/>
+                      <a:ext cx="3343742" cy="4220164"/>
                     </a:xfrm>
                     <a:prstGeom prst="rect">
                       <a:avLst/>
@@ -346,16 +311,31 @@
           <w:lang w:val="en-GB"/>
         </w:rPr>
       </w:pPr>
-      <w:r>
-        <w:rPr>
+    </w:p>
+    <w:p>
+      <w:pPr>
+        <w:rPr>
+          <w:lang w:val="en-GB"/>
+        </w:rPr>
+      </w:pPr>
+    </w:p>
+    <w:p>
+      <w:pPr>
+        <w:rPr>
+          <w:lang w:val="en-GB"/>
+        </w:rPr>
+      </w:pPr>
+      <w:r>
+        <w:rPr>
+          <w:noProof/>
           <w:lang w:val="en-GB"/>
         </w:rPr>
         <w:lastRenderedPageBreak/>
         <w:drawing>
-          <wp:inline distT="0" distB="0" distL="0" distR="0" wp14:anchorId="1FF22606" wp14:editId="27A97033">
-            <wp:extent cx="4258269" cy="8316486"/>
-            <wp:effectExtent l="0" t="0" r="9525" b="8890"/>
-            <wp:docPr id="2" name="Picture 2"/>
+          <wp:inline distT="0" distB="0" distL="0" distR="0" wp14:anchorId="641AE1B4" wp14:editId="7651A428">
+            <wp:extent cx="4515480" cy="8554644"/>
+            <wp:effectExtent l="0" t="0" r="0" b="0"/>
+            <wp:docPr id="1" name="Picture 1"/>
             <wp:cNvGraphicFramePr>
               <a:graphicFrameLocks xmlns:a="http://schemas.openxmlformats.org/drawingml/2006/main" noChangeAspect="1"/>
             </wp:cNvGraphicFramePr>
@@ -375,7 +355,7 @@
                   <pic:spPr>
                     <a:xfrm>
                       <a:off x="0" y="0"/>
-                      <a:ext cx="4258269" cy="8316486"/>
+                      <a:ext cx="4515480" cy="8554644"/>
                     </a:xfrm>
                     <a:prstGeom prst="rect">
                       <a:avLst/>
@@ -403,14 +383,15 @@
       </w:pPr>
       <w:r>
         <w:rPr>
+          <w:noProof/>
           <w:lang w:val="en-GB"/>
         </w:rPr>
         <w:lastRenderedPageBreak/>
         <w:drawing>
-          <wp:inline distT="0" distB="0" distL="0" distR="0" wp14:anchorId="110C7922" wp14:editId="268FD968">
-            <wp:extent cx="4258269" cy="6782747"/>
-            <wp:effectExtent l="0" t="0" r="9525" b="0"/>
-            <wp:docPr id="3" name="Picture 3"/>
+          <wp:inline distT="0" distB="0" distL="0" distR="0" wp14:anchorId="1FF22606" wp14:editId="27A97033">
+            <wp:extent cx="4258269" cy="8316486"/>
+            <wp:effectExtent l="0" t="0" r="9525" b="8890"/>
+            <wp:docPr id="2" name="Picture 2"/>
             <wp:cNvGraphicFramePr>
               <a:graphicFrameLocks xmlns:a="http://schemas.openxmlformats.org/drawingml/2006/main" noChangeAspect="1"/>
             </wp:cNvGraphicFramePr>
@@ -430,7 +411,7 @@
                   <pic:spPr>
                     <a:xfrm>
                       <a:off x="0" y="0"/>
-                      <a:ext cx="4258269" cy="6782747"/>
+                      <a:ext cx="4258269" cy="8316486"/>
                     </a:xfrm>
                     <a:prstGeom prst="rect">
                       <a:avLst/>
@@ -449,16 +430,24 @@
           <w:lang w:val="en-GB"/>
         </w:rPr>
       </w:pPr>
-      <w:r>
-        <w:rPr>
+    </w:p>
+    <w:p>
+      <w:pPr>
+        <w:rPr>
+          <w:lang w:val="en-GB"/>
+        </w:rPr>
+      </w:pPr>
+      <w:r>
+        <w:rPr>
+          <w:noProof/>
           <w:lang w:val="en-GB"/>
         </w:rPr>
         <w:lastRenderedPageBreak/>
         <w:drawing>
-          <wp:inline distT="0" distB="0" distL="0" distR="0" wp14:anchorId="612B43DA" wp14:editId="53D6EBB2">
-            <wp:extent cx="4029637" cy="8002117"/>
+          <wp:inline distT="0" distB="0" distL="0" distR="0" wp14:anchorId="110C7922" wp14:editId="268FD968">
+            <wp:extent cx="4258269" cy="6782747"/>
             <wp:effectExtent l="0" t="0" r="9525" b="0"/>
-            <wp:docPr id="4" name="Picture 4"/>
+            <wp:docPr id="3" name="Picture 3"/>
             <wp:cNvGraphicFramePr>
               <a:graphicFrameLocks xmlns:a="http://schemas.openxmlformats.org/drawingml/2006/main" noChangeAspect="1"/>
             </wp:cNvGraphicFramePr>
@@ -478,7 +467,7 @@
                   <pic:spPr>
                     <a:xfrm>
                       <a:off x="0" y="0"/>
-                      <a:ext cx="4029637" cy="8002117"/>
+                      <a:ext cx="4258269" cy="6782747"/>
                     </a:xfrm>
                     <a:prstGeom prst="rect">
                       <a:avLst/>
@@ -497,23 +486,17 @@
           <w:lang w:val="en-GB"/>
         </w:rPr>
       </w:pPr>
-    </w:p>
-    <w:p>
-      <w:pPr>
-        <w:rPr>
-          <w:lang w:val="en-GB"/>
-        </w:rPr>
-      </w:pPr>
-      <w:r>
-        <w:rPr>
+      <w:r>
+        <w:rPr>
+          <w:noProof/>
           <w:lang w:val="en-GB"/>
         </w:rPr>
         <w:lastRenderedPageBreak/>
         <w:drawing>
-          <wp:inline distT="0" distB="0" distL="0" distR="0" wp14:anchorId="0B89BFD4" wp14:editId="3E90F112">
-            <wp:extent cx="2876951" cy="5306165"/>
-            <wp:effectExtent l="0" t="0" r="0" b="8890"/>
-            <wp:docPr id="18" name="Picture 18"/>
+          <wp:inline distT="0" distB="0" distL="0" distR="0" wp14:anchorId="612B43DA" wp14:editId="53D6EBB2">
+            <wp:extent cx="4029637" cy="8002117"/>
+            <wp:effectExtent l="0" t="0" r="9525" b="0"/>
+            <wp:docPr id="4" name="Picture 4"/>
             <wp:cNvGraphicFramePr>
               <a:graphicFrameLocks xmlns:a="http://schemas.openxmlformats.org/drawingml/2006/main" noChangeAspect="1"/>
             </wp:cNvGraphicFramePr>
@@ -533,7 +516,7 @@
                   <pic:spPr>
                     <a:xfrm>
                       <a:off x="0" y="0"/>
-                      <a:ext cx="2876951" cy="5306165"/>
+                      <a:ext cx="4029637" cy="8002117"/>
                     </a:xfrm>
                     <a:prstGeom prst="rect">
                       <a:avLst/>
@@ -552,16 +535,24 @@
           <w:lang w:val="en-GB"/>
         </w:rPr>
       </w:pPr>
-      <w:r>
-        <w:rPr>
+    </w:p>
+    <w:p>
+      <w:pPr>
+        <w:rPr>
+          <w:lang w:val="en-GB"/>
+        </w:rPr>
+      </w:pPr>
+      <w:r>
+        <w:rPr>
+          <w:noProof/>
           <w:lang w:val="en-GB"/>
         </w:rPr>
         <w:lastRenderedPageBreak/>
         <w:drawing>
-          <wp:inline distT="0" distB="0" distL="0" distR="0" wp14:anchorId="4C4983B3" wp14:editId="3B4E3A80">
-            <wp:extent cx="4324954" cy="7954485"/>
-            <wp:effectExtent l="0" t="0" r="0" b="0"/>
-            <wp:docPr id="5" name="Picture 5"/>
+          <wp:inline distT="0" distB="0" distL="0" distR="0" wp14:anchorId="0B89BFD4" wp14:editId="3E90F112">
+            <wp:extent cx="2876951" cy="5306165"/>
+            <wp:effectExtent l="0" t="0" r="0" b="8890"/>
+            <wp:docPr id="18" name="Picture 18"/>
             <wp:cNvGraphicFramePr>
               <a:graphicFrameLocks xmlns:a="http://schemas.openxmlformats.org/drawingml/2006/main" noChangeAspect="1"/>
             </wp:cNvGraphicFramePr>
@@ -581,7 +572,7 @@
                   <pic:spPr>
                     <a:xfrm>
                       <a:off x="0" y="0"/>
-                      <a:ext cx="4324954" cy="7954485"/>
+                      <a:ext cx="2876951" cy="5306165"/>
                     </a:xfrm>
                     <a:prstGeom prst="rect">
                       <a:avLst/>
@@ -602,14 +593,15 @@
       </w:pPr>
       <w:r>
         <w:rPr>
+          <w:noProof/>
           <w:lang w:val="en-GB"/>
         </w:rPr>
         <w:lastRenderedPageBreak/>
         <w:drawing>
-          <wp:inline distT="0" distB="0" distL="0" distR="0" wp14:anchorId="48C247C7" wp14:editId="60487E40">
-            <wp:extent cx="4839375" cy="6868484"/>
-            <wp:effectExtent l="0" t="0" r="0" b="8890"/>
-            <wp:docPr id="6" name="Picture 6"/>
+          <wp:inline distT="0" distB="0" distL="0" distR="0" wp14:anchorId="4C4983B3" wp14:editId="3B4E3A80">
+            <wp:extent cx="4324954" cy="7954485"/>
+            <wp:effectExtent l="0" t="0" r="0" b="0"/>
+            <wp:docPr id="5" name="Picture 5"/>
             <wp:cNvGraphicFramePr>
               <a:graphicFrameLocks xmlns:a="http://schemas.openxmlformats.org/drawingml/2006/main" noChangeAspect="1"/>
             </wp:cNvGraphicFramePr>
@@ -629,7 +621,7 @@
                   <pic:spPr>
                     <a:xfrm>
                       <a:off x="0" y="0"/>
-                      <a:ext cx="4839375" cy="6868484"/>
+                      <a:ext cx="4324954" cy="7954485"/>
                     </a:xfrm>
                     <a:prstGeom prst="rect">
                       <a:avLst/>
@@ -650,14 +642,15 @@
       </w:pPr>
       <w:r>
         <w:rPr>
+          <w:noProof/>
           <w:lang w:val="en-GB"/>
         </w:rPr>
         <w:lastRenderedPageBreak/>
         <w:drawing>
-          <wp:inline distT="0" distB="0" distL="0" distR="0" wp14:anchorId="51E30B34" wp14:editId="0E319C04">
-            <wp:extent cx="4753638" cy="6182588"/>
-            <wp:effectExtent l="0" t="0" r="8890" b="8890"/>
-            <wp:docPr id="7" name="Picture 7"/>
+          <wp:inline distT="0" distB="0" distL="0" distR="0" wp14:anchorId="48C247C7" wp14:editId="60487E40">
+            <wp:extent cx="4839375" cy="6868484"/>
+            <wp:effectExtent l="0" t="0" r="0" b="8890"/>
+            <wp:docPr id="6" name="Picture 6"/>
             <wp:cNvGraphicFramePr>
               <a:graphicFrameLocks xmlns:a="http://schemas.openxmlformats.org/drawingml/2006/main" noChangeAspect="1"/>
             </wp:cNvGraphicFramePr>
@@ -677,7 +670,7 @@
                   <pic:spPr>
                     <a:xfrm>
                       <a:off x="0" y="0"/>
-                      <a:ext cx="4753638" cy="6182588"/>
+                      <a:ext cx="4839375" cy="6868484"/>
                     </a:xfrm>
                     <a:prstGeom prst="rect">
                       <a:avLst/>
@@ -698,14 +691,15 @@
       </w:pPr>
       <w:r>
         <w:rPr>
+          <w:noProof/>
           <w:lang w:val="en-GB"/>
         </w:rPr>
         <w:lastRenderedPageBreak/>
         <w:drawing>
-          <wp:inline distT="0" distB="0" distL="0" distR="0" wp14:anchorId="1005FC4C" wp14:editId="50ACB032">
-            <wp:extent cx="4058216" cy="7763958"/>
-            <wp:effectExtent l="0" t="0" r="0" b="8890"/>
-            <wp:docPr id="8" name="Picture 8"/>
+          <wp:inline distT="0" distB="0" distL="0" distR="0" wp14:anchorId="51E30B34" wp14:editId="0E319C04">
+            <wp:extent cx="4753638" cy="6182588"/>
+            <wp:effectExtent l="0" t="0" r="8890" b="8890"/>
+            <wp:docPr id="7" name="Picture 7"/>
             <wp:cNvGraphicFramePr>
               <a:graphicFrameLocks xmlns:a="http://schemas.openxmlformats.org/drawingml/2006/main" noChangeAspect="1"/>
             </wp:cNvGraphicFramePr>
@@ -725,7 +719,7 @@
                   <pic:spPr>
                     <a:xfrm>
                       <a:off x="0" y="0"/>
-                      <a:ext cx="4058216" cy="7763958"/>
+                      <a:ext cx="4753638" cy="6182588"/>
                     </a:xfrm>
                     <a:prstGeom prst="rect">
                       <a:avLst/>
@@ -746,14 +740,15 @@
       </w:pPr>
       <w:r>
         <w:rPr>
+          <w:noProof/>
           <w:lang w:val="en-GB"/>
         </w:rPr>
         <w:lastRenderedPageBreak/>
         <w:drawing>
-          <wp:inline distT="0" distB="0" distL="0" distR="0" wp14:anchorId="543FA371" wp14:editId="286E1457">
-            <wp:extent cx="4515480" cy="7897327"/>
+          <wp:inline distT="0" distB="0" distL="0" distR="0" wp14:anchorId="1005FC4C" wp14:editId="50ACB032">
+            <wp:extent cx="4058216" cy="7763958"/>
             <wp:effectExtent l="0" t="0" r="0" b="8890"/>
-            <wp:docPr id="9" name="Picture 9"/>
+            <wp:docPr id="8" name="Picture 8"/>
             <wp:cNvGraphicFramePr>
               <a:graphicFrameLocks xmlns:a="http://schemas.openxmlformats.org/drawingml/2006/main" noChangeAspect="1"/>
             </wp:cNvGraphicFramePr>
@@ -773,7 +768,7 @@
                   <pic:spPr>
                     <a:xfrm>
                       <a:off x="0" y="0"/>
-                      <a:ext cx="4515480" cy="7897327"/>
+                      <a:ext cx="4058216" cy="7763958"/>
                     </a:xfrm>
                     <a:prstGeom prst="rect">
                       <a:avLst/>
@@ -792,23 +787,17 @@
           <w:lang w:val="en-GB"/>
         </w:rPr>
       </w:pPr>
-    </w:p>
-    <w:p>
-      <w:pPr>
-        <w:rPr>
-          <w:lang w:val="en-GB"/>
-        </w:rPr>
-      </w:pPr>
-      <w:r>
-        <w:rPr>
+      <w:r>
+        <w:rPr>
+          <w:noProof/>
           <w:lang w:val="en-GB"/>
         </w:rPr>
         <w:lastRenderedPageBreak/>
         <w:drawing>
-          <wp:inline distT="0" distB="0" distL="0" distR="0" wp14:anchorId="226D6F6E" wp14:editId="5B588A87">
-            <wp:extent cx="4906060" cy="8707065"/>
-            <wp:effectExtent l="0" t="0" r="8890" b="0"/>
-            <wp:docPr id="10" name="Picture 10"/>
+          <wp:inline distT="0" distB="0" distL="0" distR="0" wp14:anchorId="543FA371" wp14:editId="286E1457">
+            <wp:extent cx="4515480" cy="7897327"/>
+            <wp:effectExtent l="0" t="0" r="0" b="8890"/>
+            <wp:docPr id="9" name="Picture 9"/>
             <wp:cNvGraphicFramePr>
               <a:graphicFrameLocks xmlns:a="http://schemas.openxmlformats.org/drawingml/2006/main" noChangeAspect="1"/>
             </wp:cNvGraphicFramePr>
@@ -828,7 +817,7 @@
                   <pic:spPr>
                     <a:xfrm>
                       <a:off x="0" y="0"/>
-                      <a:ext cx="4906060" cy="8707065"/>
+                      <a:ext cx="4515480" cy="7897327"/>
                     </a:xfrm>
                     <a:prstGeom prst="rect">
                       <a:avLst/>
@@ -847,16 +836,24 @@
           <w:lang w:val="en-GB"/>
         </w:rPr>
       </w:pPr>
-      <w:r>
-        <w:rPr>
+    </w:p>
+    <w:p>
+      <w:pPr>
+        <w:rPr>
+          <w:lang w:val="en-GB"/>
+        </w:rPr>
+      </w:pPr>
+      <w:r>
+        <w:rPr>
+          <w:noProof/>
           <w:lang w:val="en-GB"/>
         </w:rPr>
         <w:lastRenderedPageBreak/>
         <w:drawing>
-          <wp:inline distT="0" distB="0" distL="0" distR="0" wp14:anchorId="6252FB3E" wp14:editId="247D77B4">
-            <wp:extent cx="4953691" cy="3734321"/>
-            <wp:effectExtent l="0" t="0" r="0" b="0"/>
-            <wp:docPr id="11" name="Picture 11"/>
+          <wp:inline distT="0" distB="0" distL="0" distR="0" wp14:anchorId="226D6F6E" wp14:editId="5B588A87">
+            <wp:extent cx="4906060" cy="8707065"/>
+            <wp:effectExtent l="0" t="0" r="8890" b="0"/>
+            <wp:docPr id="10" name="Picture 10"/>
             <wp:cNvGraphicFramePr>
               <a:graphicFrameLocks xmlns:a="http://schemas.openxmlformats.org/drawingml/2006/main" noChangeAspect="1"/>
             </wp:cNvGraphicFramePr>
@@ -876,7 +873,7 @@
                   <pic:spPr>
                     <a:xfrm>
                       <a:off x="0" y="0"/>
-                      <a:ext cx="4953691" cy="3734321"/>
+                      <a:ext cx="4906060" cy="8707065"/>
                     </a:xfrm>
                     <a:prstGeom prst="rect">
                       <a:avLst/>
@@ -897,14 +894,15 @@
       </w:pPr>
       <w:r>
         <w:rPr>
+          <w:noProof/>
           <w:lang w:val="en-GB"/>
         </w:rPr>
         <w:lastRenderedPageBreak/>
         <w:drawing>
-          <wp:inline distT="0" distB="0" distL="0" distR="0" wp14:anchorId="2479E851" wp14:editId="73D22797">
-            <wp:extent cx="4267796" cy="7744906"/>
+          <wp:inline distT="0" distB="0" distL="0" distR="0" wp14:anchorId="6252FB3E" wp14:editId="247D77B4">
+            <wp:extent cx="4953691" cy="3734321"/>
             <wp:effectExtent l="0" t="0" r="0" b="0"/>
-            <wp:docPr id="12" name="Picture 12"/>
+            <wp:docPr id="11" name="Picture 11"/>
             <wp:cNvGraphicFramePr>
               <a:graphicFrameLocks xmlns:a="http://schemas.openxmlformats.org/drawingml/2006/main" noChangeAspect="1"/>
             </wp:cNvGraphicFramePr>
@@ -924,7 +922,7 @@
                   <pic:spPr>
                     <a:xfrm>
                       <a:off x="0" y="0"/>
-                      <a:ext cx="4267796" cy="7744906"/>
+                      <a:ext cx="4953691" cy="3734321"/>
                     </a:xfrm>
                     <a:prstGeom prst="rect">
                       <a:avLst/>
@@ -945,14 +943,15 @@
       </w:pPr>
       <w:r>
         <w:rPr>
+          <w:noProof/>
           <w:lang w:val="en-GB"/>
         </w:rPr>
         <w:lastRenderedPageBreak/>
         <w:drawing>
-          <wp:inline distT="0" distB="0" distL="0" distR="0" wp14:anchorId="0C34B7B8" wp14:editId="5D78D3C0">
-            <wp:extent cx="4763165" cy="5830114"/>
+          <wp:inline distT="0" distB="0" distL="0" distR="0" wp14:anchorId="2479E851" wp14:editId="73D22797">
+            <wp:extent cx="4267796" cy="7744906"/>
             <wp:effectExtent l="0" t="0" r="0" b="0"/>
-            <wp:docPr id="13" name="Picture 13"/>
+            <wp:docPr id="12" name="Picture 12"/>
             <wp:cNvGraphicFramePr>
               <a:graphicFrameLocks xmlns:a="http://schemas.openxmlformats.org/drawingml/2006/main" noChangeAspect="1"/>
             </wp:cNvGraphicFramePr>
@@ -972,7 +971,7 @@
                   <pic:spPr>
                     <a:xfrm>
                       <a:off x="0" y="0"/>
-                      <a:ext cx="4763165" cy="5830114"/>
+                      <a:ext cx="4267796" cy="7744906"/>
                     </a:xfrm>
                     <a:prstGeom prst="rect">
                       <a:avLst/>
@@ -993,14 +992,15 @@
       </w:pPr>
       <w:r>
         <w:rPr>
+          <w:noProof/>
           <w:lang w:val="en-GB"/>
         </w:rPr>
         <w:lastRenderedPageBreak/>
         <w:drawing>
-          <wp:inline distT="0" distB="0" distL="0" distR="0" wp14:anchorId="4F1ACDBD" wp14:editId="5253BDED">
-            <wp:extent cx="4934639" cy="3372321"/>
+          <wp:inline distT="0" distB="0" distL="0" distR="0" wp14:anchorId="0C34B7B8" wp14:editId="5D78D3C0">
+            <wp:extent cx="4763165" cy="5830114"/>
             <wp:effectExtent l="0" t="0" r="0" b="0"/>
-            <wp:docPr id="14" name="Picture 14"/>
+            <wp:docPr id="13" name="Picture 13"/>
             <wp:cNvGraphicFramePr>
               <a:graphicFrameLocks xmlns:a="http://schemas.openxmlformats.org/drawingml/2006/main" noChangeAspect="1"/>
             </wp:cNvGraphicFramePr>
@@ -1020,7 +1020,7 @@
                   <pic:spPr>
                     <a:xfrm>
                       <a:off x="0" y="0"/>
-                      <a:ext cx="4934639" cy="3372321"/>
+                      <a:ext cx="4763165" cy="5830114"/>
                     </a:xfrm>
                     <a:prstGeom prst="rect">
                       <a:avLst/>
@@ -1041,14 +1041,15 @@
       </w:pPr>
       <w:r>
         <w:rPr>
+          <w:noProof/>
           <w:lang w:val="en-GB"/>
         </w:rPr>
         <w:lastRenderedPageBreak/>
         <w:drawing>
-          <wp:inline distT="0" distB="0" distL="0" distR="0" wp14:anchorId="6105945B" wp14:editId="2E1958CD">
-            <wp:extent cx="5106113" cy="8335538"/>
-            <wp:effectExtent l="0" t="0" r="0" b="8890"/>
-            <wp:docPr id="15" name="Picture 15"/>
+          <wp:inline distT="0" distB="0" distL="0" distR="0" wp14:anchorId="4F1ACDBD" wp14:editId="5253BDED">
+            <wp:extent cx="4934639" cy="3372321"/>
+            <wp:effectExtent l="0" t="0" r="0" b="0"/>
+            <wp:docPr id="14" name="Picture 14"/>
             <wp:cNvGraphicFramePr>
               <a:graphicFrameLocks xmlns:a="http://schemas.openxmlformats.org/drawingml/2006/main" noChangeAspect="1"/>
             </wp:cNvGraphicFramePr>
@@ -1068,7 +1069,7 @@
                   <pic:spPr>
                     <a:xfrm>
                       <a:off x="0" y="0"/>
-                      <a:ext cx="5106113" cy="8335538"/>
+                      <a:ext cx="4934639" cy="3372321"/>
                     </a:xfrm>
                     <a:prstGeom prst="rect">
                       <a:avLst/>
@@ -1089,14 +1090,15 @@
       </w:pPr>
       <w:r>
         <w:rPr>
+          <w:noProof/>
           <w:lang w:val="en-GB"/>
         </w:rPr>
         <w:lastRenderedPageBreak/>
         <w:drawing>
-          <wp:inline distT="0" distB="0" distL="0" distR="0" wp14:anchorId="2D47BF4F" wp14:editId="3482FB1D">
-            <wp:extent cx="4182059" cy="5496692"/>
-            <wp:effectExtent l="0" t="0" r="9525" b="0"/>
-            <wp:docPr id="16" name="Picture 16"/>
+          <wp:inline distT="0" distB="0" distL="0" distR="0" wp14:anchorId="6105945B" wp14:editId="2E1958CD">
+            <wp:extent cx="5106113" cy="8335538"/>
+            <wp:effectExtent l="0" t="0" r="0" b="8890"/>
+            <wp:docPr id="15" name="Picture 15"/>
             <wp:cNvGraphicFramePr>
               <a:graphicFrameLocks xmlns:a="http://schemas.openxmlformats.org/drawingml/2006/main" noChangeAspect="1"/>
             </wp:cNvGraphicFramePr>
@@ -1116,6 +1118,55 @@
                   <pic:spPr>
                     <a:xfrm>
                       <a:off x="0" y="0"/>
+                      <a:ext cx="5106113" cy="8335538"/>
+                    </a:xfrm>
+                    <a:prstGeom prst="rect">
+                      <a:avLst/>
+                    </a:prstGeom>
+                  </pic:spPr>
+                </pic:pic>
+              </a:graphicData>
+            </a:graphic>
+          </wp:inline>
+        </w:drawing>
+      </w:r>
+    </w:p>
+    <w:p>
+      <w:pPr>
+        <w:rPr>
+          <w:lang w:val="en-GB"/>
+        </w:rPr>
+      </w:pPr>
+      <w:r>
+        <w:rPr>
+          <w:noProof/>
+          <w:lang w:val="en-GB"/>
+        </w:rPr>
+        <w:lastRenderedPageBreak/>
+        <w:drawing>
+          <wp:inline distT="0" distB="0" distL="0" distR="0" wp14:anchorId="2D47BF4F" wp14:editId="3482FB1D">
+            <wp:extent cx="4182059" cy="5496692"/>
+            <wp:effectExtent l="0" t="0" r="9525" b="0"/>
+            <wp:docPr id="16" name="Picture 16"/>
+            <wp:cNvGraphicFramePr>
+              <a:graphicFrameLocks xmlns:a="http://schemas.openxmlformats.org/drawingml/2006/main" noChangeAspect="1"/>
+            </wp:cNvGraphicFramePr>
+            <a:graphic xmlns:a="http://schemas.openxmlformats.org/drawingml/2006/main">
+              <a:graphicData uri="http://schemas.openxmlformats.org/drawingml/2006/picture">
+                <pic:pic xmlns:pic="http://schemas.openxmlformats.org/drawingml/2006/picture">
+                  <pic:nvPicPr>
+                    <pic:cNvPr id="1" name=""/>
+                    <pic:cNvPicPr/>
+                  </pic:nvPicPr>
+                  <pic:blipFill>
+                    <a:blip r:embed="rId24"/>
+                    <a:stretch>
+                      <a:fillRect/>
+                    </a:stretch>
+                  </pic:blipFill>
+                  <pic:spPr>
+                    <a:xfrm>
+                      <a:off x="0" y="0"/>
                       <a:ext cx="4182059" cy="5496692"/>
                     </a:xfrm>
                     <a:prstGeom prst="rect">
@@ -1137,6 +1188,7 @@
       </w:pPr>
       <w:r>
         <w:rPr>
+          <w:noProof/>
           <w:lang w:val="en-GB"/>
         </w:rPr>
         <w:lastRenderedPageBreak/>
@@ -1156,7 +1208,7 @@
                     <pic:cNvPicPr/>
                   </pic:nvPicPr>
                   <pic:blipFill>
-                    <a:blip r:embed="rId24"/>
+                    <a:blip r:embed="rId25"/>
                     <a:stretch>
                       <a:fillRect/>
                     </a:stretch>

</xml_diff>